<commit_message>
paper: per-class wiring-asymmetry finding (data: results/per_class.json)
</commit_message>
<xml_diff>
--- a/paper/MEGA27-23a-fly-connectome-GNN-v2.docx
+++ b/paper/MEGA27-23a-fly-connectome-GNN-v2.docx
@@ -102,6 +102,19 @@
     <w:p>
       <w:r>
         <w:t>The degree distribution is heavy-tailed in both directions (Figure, right), consistent with hub-mediated brain organization reported for this connectome.</w:t>
+      </w:r>
+    </w:p>
+    <w:p>
+      <w:pPr>
+        <w:pStyle w:val="Heading1"/>
+      </w:pPr>
+      <w:r>
+        <w:t>Per-class anatomy of the result</w:t>
+      </w:r>
+    </w:p>
+    <w:p>
+      <w:r>
+        <w:t>Per-class held-out accuracy (seed 11, results/per_class.json) reveals where wiring speaks loudest: sensory neurons 0.95, mushroom-body Kenyon cells 1.00, pre-DN-VNC 0.92 and RGN 0.91 are nearly solved by the graph alone; CN, DN-SEZ, ascending and pre-DN-SEZ sit at or near zero - their wiring signatures overlap with sibling descending classes. The asymmetry is itself the biology: peripheral and learning-center neurons are wired stereotypically, while descending premotor classes share convergent output-stage connectivity that morphology carries better.</w:t>
       </w:r>
     </w:p>
     <w:p>

</xml_diff>